<commit_message>
docs: jobdesk per anggota dan daftar kerja minggu 5 (mobile lebih dulu)
</commit_message>
<xml_diff>
--- a/Pembagian Tugas/timeline.docx
+++ b/Pembagian Tugas/timeline.docx
@@ -2,7 +2,7 @@
 <file path=word/document.xml><?xml version="1.0" encoding="utf-8"?>
 <w:document xmlns:w="http://schemas.openxmlformats.org/wordprocessingml/2006/main" xmlns:m="http://schemas.openxmlformats.org/officeDocument/2006/math" xmlns:r="http://schemas.openxmlformats.org/officeDocument/2006/relationships" xmlns:o="urn:schemas-microsoft-com:office:office" xmlns:v="urn:schemas-microsoft-com:vml" xmlns:w10="urn:schemas-microsoft-com:office:word" xmlns:a="http://schemas.openxmlformats.org/drawingml/2006/main" xmlns:pic="http://schemas.openxmlformats.org/drawingml/2006/picture" xmlns:wp="http://schemas.openxmlformats.org/drawingml/2006/wordprocessingDrawing">
   <w:body>
-    <w:bookmarkStart w:id="27" w:name="sera-z--timeline-proyek-10-minggu"/>
+    <w:bookmarkStart w:id="28" w:name="sera-z--timeline-proyek-10-minggu"/>
     <w:p>
       <w:pPr>
         <w:pStyle w:val="Heading1"/>
@@ -2528,8 +2528,650 @@
         <w:t xml:space="preserve">laporan.</w:t>
       </w:r>
     </w:p>
+    <w:p>
+      <w:r>
+        <w:pict>
+          <v:rect style="width:0;height:1.5pt" o:hralign="center" o:hrstd="t" o:hr="t"/>
+        </w:pict>
+      </w:r>
+    </w:p>
     <w:bookmarkEnd w:id="26"/>
+    <w:bookmarkStart w:id="27" w:name="X87e37b8e062a38ec0e2c792950227b8707f5993"/>
+    <w:p>
+      <w:pPr>
+        <w:pStyle w:val="Heading2"/>
+      </w:pPr>
+      <w:r>
+        <w:t xml:space="preserve">8. Prioritas eksekusi: mobile dulu, ML menyusul</w:t>
+      </w:r>
+    </w:p>
+    <w:p>
+      <w:pPr>
+        <w:pStyle w:val="FirstParagraph"/>
+      </w:pPr>
+      <w:r>
+        <w:t xml:space="preserve">Jalur kritis di atas bersifat teknis: tanpa E4/E6, integrasi tidak bisa jalan.</w:t>
+      </w:r>
+      <w:r>
+        <w:t xml:space="preserve"> </w:t>
+      </w:r>
+      <w:r>
+        <w:t xml:space="preserve">Namun urutan</w:t>
+      </w:r>
+      <w:r>
+        <w:t xml:space="preserve"> </w:t>
+      </w:r>
+      <w:r>
+        <w:rPr>
+          <w:bCs/>
+          <w:b/>
+        </w:rPr>
+        <w:t xml:space="preserve">pengerjaan harian</w:t>
+      </w:r>
+      <w:r>
+        <w:t xml:space="preserve"> </w:t>
+      </w:r>
+      <w:r>
+        <w:t xml:space="preserve">disusun agar aplikasi bisa dipakai lebih dulu.</w:t>
+      </w:r>
+      <w:r>
+        <w:t xml:space="preserve"> </w:t>
+      </w:r>
+      <w:r>
+        <w:t xml:space="preserve">ML tetap berjalan sebagai tugas latar, bukan ditinggalkan.</w:t>
+      </w:r>
+    </w:p>
+    <w:tbl>
+      <w:tblPr>
+        <w:tblStyle w:val="Table"/>
+        <w:tblW w:type="pct" w:w="0.0"/>
+        <w:tblLook w:firstRow="1" w:lastRow="0" w:firstColumn="0" w:lastColumn="0" w:noHBand="0" w:noVBand="0" w:val="0020"/>
+      </w:tblPr>
+      <w:tblGrid/>
+      <w:tr>
+        <w:tc>
+          <w:p>
+            <w:pPr>
+              <w:pStyle w:val="Compact"/>
+              <w:jc w:val="left"/>
+            </w:pPr>
+            <w:r>
+              <w:t xml:space="preserve">Prioritas</w:t>
+            </w:r>
+          </w:p>
+        </w:tc>
+        <w:tc>
+          <w:p>
+            <w:pPr>
+              <w:pStyle w:val="Compact"/>
+              <w:jc w:val="left"/>
+            </w:pPr>
+            <w:r>
+              <w:t xml:space="preserve">Tugas</w:t>
+            </w:r>
+          </w:p>
+        </w:tc>
+        <w:tc>
+          <w:p>
+            <w:pPr>
+              <w:pStyle w:val="Compact"/>
+              <w:jc w:val="left"/>
+            </w:pPr>
+            <w:r>
+              <w:t xml:space="preserve">Alasan</w:t>
+            </w:r>
+          </w:p>
+        </w:tc>
+        <w:tc>
+          <w:p>
+            <w:pPr>
+              <w:pStyle w:val="Compact"/>
+              <w:jc w:val="left"/>
+            </w:pPr>
+            <w:r>
+              <w:t xml:space="preserve">Perkiraan</w:t>
+            </w:r>
+          </w:p>
+        </w:tc>
+      </w:tr>
+      <w:tr>
+        <w:tc>
+          <w:p>
+            <w:pPr>
+              <w:pStyle w:val="Compact"/>
+              <w:jc w:val="left"/>
+            </w:pPr>
+            <w:r>
+              <w:t xml:space="preserve">P0</w:t>
+            </w:r>
+          </w:p>
+        </w:tc>
+        <w:tc>
+          <w:p>
+            <w:pPr>
+              <w:pStyle w:val="Compact"/>
+              <w:jc w:val="left"/>
+            </w:pPr>
+            <w:r>
+              <w:t xml:space="preserve">E2.1, E2.2</w:t>
+            </w:r>
+          </w:p>
+        </w:tc>
+        <w:tc>
+          <w:p>
+            <w:pPr>
+              <w:pStyle w:val="Compact"/>
+              <w:jc w:val="left"/>
+            </w:pPr>
+            <w:r>
+              <w:t xml:space="preserve">Membuka empat tugas fitur sekaligus</w:t>
+            </w:r>
+          </w:p>
+        </w:tc>
+        <w:tc>
+          <w:p>
+            <w:pPr>
+              <w:pStyle w:val="Compact"/>
+              <w:jc w:val="left"/>
+            </w:pPr>
+            <w:r>
+              <w:t xml:space="preserve">Minggu 5</w:t>
+            </w:r>
+          </w:p>
+        </w:tc>
+      </w:tr>
+      <w:tr>
+        <w:tc>
+          <w:p>
+            <w:pPr>
+              <w:pStyle w:val="Compact"/>
+              <w:jc w:val="left"/>
+            </w:pPr>
+            <w:r>
+              <w:t xml:space="preserve">P0</w:t>
+            </w:r>
+          </w:p>
+        </w:tc>
+        <w:tc>
+          <w:p>
+            <w:pPr>
+              <w:pStyle w:val="Compact"/>
+              <w:jc w:val="left"/>
+            </w:pPr>
+            <w:r>
+              <w:t xml:space="preserve">E3.1</w:t>
+            </w:r>
+          </w:p>
+        </w:tc>
+        <w:tc>
+          <w:p>
+            <w:pPr>
+              <w:pStyle w:val="Compact"/>
+              <w:jc w:val="left"/>
+            </w:pPr>
+            <w:r>
+              <w:t xml:space="preserve">Membuka autentikasi lanjutan dan halaman Profil</w:t>
+            </w:r>
+          </w:p>
+        </w:tc>
+        <w:tc>
+          <w:p>
+            <w:pPr>
+              <w:pStyle w:val="Compact"/>
+              <w:jc w:val="left"/>
+            </w:pPr>
+            <w:r>
+              <w:t xml:space="preserve">Minggu 5</w:t>
+            </w:r>
+          </w:p>
+        </w:tc>
+      </w:tr>
+      <w:tr>
+        <w:tc>
+          <w:p>
+            <w:pPr>
+              <w:pStyle w:val="Compact"/>
+              <w:jc w:val="left"/>
+            </w:pPr>
+            <w:r>
+              <w:t xml:space="preserve">P0</w:t>
+            </w:r>
+          </w:p>
+        </w:tc>
+        <w:tc>
+          <w:p>
+            <w:pPr>
+              <w:pStyle w:val="Compact"/>
+              <w:jc w:val="left"/>
+            </w:pPr>
+            <w:r>
+              <w:t xml:space="preserve">E5.1</w:t>
+            </w:r>
+          </w:p>
+        </w:tc>
+        <w:tc>
+          <w:p>
+            <w:pPr>
+              <w:pStyle w:val="Compact"/>
+              <w:jc w:val="left"/>
+            </w:pPr>
+            <w:r>
+              <w:t xml:space="preserve">Tanpa prasyarat, tidak butuh dataset</w:t>
+            </w:r>
+          </w:p>
+        </w:tc>
+        <w:tc>
+          <w:p>
+            <w:pPr>
+              <w:pStyle w:val="Compact"/>
+              <w:jc w:val="left"/>
+            </w:pPr>
+            <w:r>
+              <w:t xml:space="preserve">Minggu 5</w:t>
+            </w:r>
+          </w:p>
+        </w:tc>
+      </w:tr>
+      <w:tr>
+        <w:tc>
+          <w:p>
+            <w:pPr>
+              <w:pStyle w:val="Compact"/>
+              <w:jc w:val="left"/>
+            </w:pPr>
+            <w:r>
+              <w:t xml:space="preserve">P0</w:t>
+            </w:r>
+          </w:p>
+        </w:tc>
+        <w:tc>
+          <w:p>
+            <w:pPr>
+              <w:pStyle w:val="Compact"/>
+              <w:jc w:val="left"/>
+            </w:pPr>
+            <w:r>
+              <w:t xml:space="preserve">E9.1</w:t>
+            </w:r>
+          </w:p>
+        </w:tc>
+        <w:tc>
+          <w:p>
+            <w:pPr>
+              <w:pStyle w:val="Compact"/>
+              <w:jc w:val="left"/>
+            </w:pPr>
+            <w:r>
+              <w:t xml:space="preserve">Harus ada sebelum pengujian; tidak butuh kode</w:t>
+            </w:r>
+          </w:p>
+        </w:tc>
+        <w:tc>
+          <w:p>
+            <w:pPr>
+              <w:pStyle w:val="Compact"/>
+              <w:jc w:val="left"/>
+            </w:pPr>
+            <w:r>
+              <w:t xml:space="preserve">Minggu 5</w:t>
+            </w:r>
+          </w:p>
+        </w:tc>
+      </w:tr>
+      <w:tr>
+        <w:tc>
+          <w:p>
+            <w:pPr>
+              <w:pStyle w:val="Compact"/>
+              <w:jc w:val="left"/>
+            </w:pPr>
+            <w:r>
+              <w:t xml:space="preserve">P0</w:t>
+            </w:r>
+          </w:p>
+        </w:tc>
+        <w:tc>
+          <w:p>
+            <w:pPr>
+              <w:pStyle w:val="Compact"/>
+              <w:jc w:val="left"/>
+            </w:pPr>
+            <w:r>
+              <w:t xml:space="preserve">Review PR #3</w:t>
+            </w:r>
+          </w:p>
+        </w:tc>
+        <w:tc>
+          <w:p>
+            <w:pPr>
+              <w:pStyle w:val="Compact"/>
+              <w:jc w:val="left"/>
+            </w:pPr>
+            <w:r>
+              <w:t xml:space="preserve">Kode ML berhenti selama PR belum digabung</w:t>
+            </w:r>
+          </w:p>
+        </w:tc>
+        <w:tc>
+          <w:p>
+            <w:pPr>
+              <w:pStyle w:val="Compact"/>
+              <w:jc w:val="left"/>
+            </w:pPr>
+            <w:r>
+              <w:t xml:space="preserve">28 Okt</w:t>
+            </w:r>
+          </w:p>
+        </w:tc>
+      </w:tr>
+      <w:tr>
+        <w:tc>
+          <w:p>
+            <w:pPr>
+              <w:pStyle w:val="Compact"/>
+              <w:jc w:val="left"/>
+            </w:pPr>
+            <w:r>
+              <w:t xml:space="preserve">P1</w:t>
+            </w:r>
+          </w:p>
+        </w:tc>
+        <w:tc>
+          <w:p>
+            <w:pPr>
+              <w:pStyle w:val="Compact"/>
+              <w:jc w:val="left"/>
+            </w:pPr>
+            <w:r>
+              <w:t xml:space="preserve">E4.1, E4.2</w:t>
+            </w:r>
+          </w:p>
+        </w:tc>
+        <w:tc>
+          <w:p>
+            <w:pPr>
+              <w:pStyle w:val="Compact"/>
+              <w:jc w:val="left"/>
+            </w:pPr>
+            <w:r>
+              <w:t xml:space="preserve">Lead time unduh; menghambat seluruh jalur ML</w:t>
+            </w:r>
+          </w:p>
+        </w:tc>
+        <w:tc>
+          <w:p>
+            <w:pPr>
+              <w:pStyle w:val="Compact"/>
+              <w:jc w:val="left"/>
+            </w:pPr>
+            <w:r>
+              <w:t xml:space="preserve">Minggu 5–6</w:t>
+            </w:r>
+          </w:p>
+        </w:tc>
+      </w:tr>
+      <w:tr>
+        <w:tc>
+          <w:p>
+            <w:pPr>
+              <w:pStyle w:val="Compact"/>
+              <w:jc w:val="left"/>
+            </w:pPr>
+            <w:r>
+              <w:t xml:space="preserve">P1</w:t>
+            </w:r>
+          </w:p>
+        </w:tc>
+        <w:tc>
+          <w:p>
+            <w:pPr>
+              <w:pStyle w:val="Compact"/>
+              <w:jc w:val="left"/>
+            </w:pPr>
+            <w:r>
+              <w:t xml:space="preserve">E2.3, E3.2, E3.3, E5.2, E8.6</w:t>
+            </w:r>
+          </w:p>
+        </w:tc>
+        <w:tc>
+          <w:p>
+            <w:pPr>
+              <w:pStyle w:val="Compact"/>
+              <w:jc w:val="left"/>
+            </w:pPr>
+            <w:r>
+              <w:t xml:space="preserve">Lanjutan langsung dari P0</w:t>
+            </w:r>
+          </w:p>
+        </w:tc>
+        <w:tc>
+          <w:p>
+            <w:pPr>
+              <w:pStyle w:val="Compact"/>
+              <w:jc w:val="left"/>
+            </w:pPr>
+            <w:r>
+              <w:t xml:space="preserve">Minggu 5–6</w:t>
+            </w:r>
+          </w:p>
+        </w:tc>
+      </w:tr>
+      <w:tr>
+        <w:tc>
+          <w:p>
+            <w:pPr>
+              <w:pStyle w:val="Compact"/>
+              <w:jc w:val="left"/>
+            </w:pPr>
+            <w:r>
+              <w:t xml:space="preserve">P2</w:t>
+            </w:r>
+          </w:p>
+        </w:tc>
+        <w:tc>
+          <w:p>
+            <w:pPr>
+              <w:pStyle w:val="Compact"/>
+              <w:jc w:val="left"/>
+            </w:pPr>
+            <w:r>
+              <w:t xml:space="preserve">E4.3, E4.4, E5.3, E5.4, E2.4, E2.5</w:t>
+            </w:r>
+          </w:p>
+        </w:tc>
+        <w:tc>
+          <w:p>
+            <w:pPr>
+              <w:pStyle w:val="Compact"/>
+              <w:jc w:val="left"/>
+            </w:pPr>
+            <w:r>
+              <w:t xml:space="preserve">Fondasi model dan penyimpanan lanjutan</w:t>
+            </w:r>
+          </w:p>
+        </w:tc>
+        <w:tc>
+          <w:p>
+            <w:pPr>
+              <w:pStyle w:val="Compact"/>
+              <w:jc w:val="left"/>
+            </w:pPr>
+            <w:r>
+              <w:t xml:space="preserve">Minggu 6</w:t>
+            </w:r>
+          </w:p>
+        </w:tc>
+      </w:tr>
+      <w:tr>
+        <w:tc>
+          <w:p>
+            <w:pPr>
+              <w:pStyle w:val="Compact"/>
+              <w:jc w:val="left"/>
+            </w:pPr>
+            <w:r>
+              <w:t xml:space="preserve">P2</w:t>
+            </w:r>
+          </w:p>
+        </w:tc>
+        <w:tc>
+          <w:p>
+            <w:pPr>
+              <w:pStyle w:val="Compact"/>
+              <w:jc w:val="left"/>
+            </w:pPr>
+            <w:r>
+              <w:t xml:space="preserve">E6.1–E6.3, E4.5, E4.6</w:t>
+            </w:r>
+          </w:p>
+        </w:tc>
+        <w:tc>
+          <w:p>
+            <w:pPr>
+              <w:pStyle w:val="Compact"/>
+              <w:jc w:val="left"/>
+            </w:pPr>
+            <w:r>
+              <w:t xml:space="preserve">Model 3 dan artefak TFLite</w:t>
+            </w:r>
+          </w:p>
+        </w:tc>
+        <w:tc>
+          <w:p>
+            <w:pPr>
+              <w:pStyle w:val="Compact"/>
+              <w:jc w:val="left"/>
+            </w:pPr>
+            <w:r>
+              <w:t xml:space="preserve">Minggu 7</w:t>
+            </w:r>
+          </w:p>
+        </w:tc>
+      </w:tr>
+      <w:tr>
+        <w:tc>
+          <w:p>
+            <w:pPr>
+              <w:pStyle w:val="Compact"/>
+              <w:jc w:val="left"/>
+            </w:pPr>
+            <w:r>
+              <w:t xml:space="preserve">P3</w:t>
+            </w:r>
+          </w:p>
+        </w:tc>
+        <w:tc>
+          <w:p>
+            <w:pPr>
+              <w:pStyle w:val="Compact"/>
+              <w:jc w:val="left"/>
+            </w:pPr>
+            <w:r>
+              <w:t xml:space="preserve">E7.1–E7.6</w:t>
+            </w:r>
+          </w:p>
+        </w:tc>
+        <w:tc>
+          <w:p>
+            <w:pPr>
+              <w:pStyle w:val="Compact"/>
+              <w:jc w:val="left"/>
+            </w:pPr>
+            <w:r>
+              <w:t xml:space="preserve">Integrasi, menunggu</w:t>
+            </w:r>
+            <w:r>
+              <w:t xml:space="preserve"> </w:t>
+            </w:r>
+            <w:r>
+              <w:rPr>
+                <w:rStyle w:val="VerbatimChar"/>
+              </w:rPr>
+              <w:t xml:space="preserve">.tflite</w:t>
+            </w:r>
+          </w:p>
+        </w:tc>
+        <w:tc>
+          <w:p>
+            <w:pPr>
+              <w:pStyle w:val="Compact"/>
+              <w:jc w:val="left"/>
+            </w:pPr>
+            <w:r>
+              <w:t xml:space="preserve">Minggu 8–9</w:t>
+            </w:r>
+          </w:p>
+        </w:tc>
+      </w:tr>
+      <w:tr>
+        <w:tc>
+          <w:p>
+            <w:pPr>
+              <w:pStyle w:val="Compact"/>
+              <w:jc w:val="left"/>
+            </w:pPr>
+            <w:r>
+              <w:t xml:space="preserve">P3</w:t>
+            </w:r>
+          </w:p>
+        </w:tc>
+        <w:tc>
+          <w:p>
+            <w:pPr>
+              <w:pStyle w:val="Compact"/>
+              <w:jc w:val="left"/>
+            </w:pPr>
+            <w:r>
+              <w:t xml:space="preserve">E8.3, E8.5</w:t>
+            </w:r>
+          </w:p>
+        </w:tc>
+        <w:tc>
+          <w:p>
+            <w:pPr>
+              <w:pStyle w:val="Compact"/>
+              <w:jc w:val="left"/>
+            </w:pPr>
+            <w:r>
+              <w:t xml:space="preserve">Menunggu skor Model 3 (E7.4)</w:t>
+            </w:r>
+          </w:p>
+        </w:tc>
+        <w:tc>
+          <w:p>
+            <w:pPr>
+              <w:pStyle w:val="Compact"/>
+              <w:jc w:val="left"/>
+            </w:pPr>
+            <w:r>
+              <w:t xml:space="preserve">Minggu 8–9</w:t>
+            </w:r>
+          </w:p>
+        </w:tc>
+      </w:tr>
+    </w:tbl>
+    <w:p>
+      <w:pPr>
+        <w:pStyle w:val="BodyText"/>
+      </w:pPr>
+      <w:r>
+        <w:t xml:space="preserve">Konsekuensi yang perlu disadari: menunda E4.1 sampai mobile selesai akan</w:t>
+      </w:r>
+      <w:r>
+        <w:t xml:space="preserve"> </w:t>
+      </w:r>
+      <w:r>
+        <w:t xml:space="preserve">menggeser E7, E8.3, E9.2, dan laporan akhir. Karena itu E4.1 tetap dijadwalkan</w:t>
+      </w:r>
+      <w:r>
+        <w:t xml:space="preserve"> </w:t>
+      </w:r>
+      <w:r>
+        <w:t xml:space="preserve">minggu ini sebagai tugas latar dengan beban 1 ho.</w:t>
+      </w:r>
+    </w:p>
     <w:bookmarkEnd w:id="27"/>
+    <w:bookmarkEnd w:id="28"/>
     <w:sectPr/>
   </w:body>
 </w:document>

</xml_diff>